<commit_message>
Finalize the scored 10 September live package.
Co-authored-by: Shen Ruililin <bobshenruililin@users.noreply.github.com>
</commit_message>
<xml_diff>
--- a/manuscript/live_collaborative/Heat_CVD_Manuscript_20260910_hogan.docx
+++ b/manuscript/live_collaborative/Heat_CVD_Manuscript_20260910_hogan.docx
@@ -2481,7 +2481,7 @@
           <w:i w:val="0"/>
           <w:sz w:val="24"/>
         </w:rPr>
-        <w:t>Period-split official-day panel</w:t>
+        <w:t>Nested-window official-day panel</w:t>
       </w:r>
     </w:p>
     <w:p>
@@ -4582,7 +4582,7 @@
           <w:i w:val="0"/>
           <w:sz w:val="24"/>
         </w:rPr>
-        <w:t xml:space="preserve">The principal result is sensitivity to the analysis window, not a pre/post effect. First-event counts had already fallen substantially by 2019, followed by a further trough in 2020. The cold-day point estimates were smaller in the full window than in the nested pre-2020 window, but their confidence intervals overlapped. The CHD hot-night interval excluded 1 only in the full window. No exposure-by-period interaction was fitted. All twelve full-window </w:t>
+        <w:t xml:space="preserve">The principal result is sensitivity to the analysis window, not a pre/post effect. First-event counts had already fallen substantially by 2019, followed by a further trough in 2020. The cold-day point estimates were smaller in the full window than in the nested pre-2020 window. Because the 84-month window is contained in the full window, this comparison does not estimate a period contrast. The CHD hot-night interval excluded 1 only in the full window. No exposure-by-period interaction was fitted. All twelve full-window </w:t>
       </w:r>
       <w:r>
         <w:rPr>
@@ -4712,7 +4712,7 @@
           <w:i w:val="0"/>
           <w:sz w:val="24"/>
         </w:rPr>
-        <w:t>Influenza transmission fell sharply during Hong Kong’s early pandemic interventions [40]. The archive influenza model covers 121 months and is not a core-adjusted Model 1 estimate (Supplementary Table S7). Pollution also declined across the decade [7]. Archive pollution models use a different joint-temperature specification and a population × days offset (Supplementary Table S9). Infection and pollution therefore remain unresolved co-exposures rather than explanations established by this analysis.</w:t>
+        <w:t>Influenza transmission fell sharply during Hong Kong’s early pandemic interventions [40]. The archive influenza model covers 121 months and is not an adjusted Model 1 estimate (Supplementary Table S7). Pollution also declined across the decade [7]. Archive pollution models use a different joint-temperature specification and a population × days offset (Supplementary Table S9). Infection and pollution therefore remain unresolved co-exposures rather than explanations established by this analysis.</w:t>
       </w:r>
     </w:p>
     <w:p>
@@ -4833,7 +4833,7 @@
           <w:i w:val="0"/>
           <w:sz w:val="24"/>
         </w:rPr>
-        <w:t>Monthly first CHD and HF hospitalisations declined across 2013–2023, with a further trough in 2020. Cold-day point estimates were larger in the nested pre-2020 window than in the full window, but the intervals overlapped and no period interaction was fitted. Later years were hotter, while cold-day frequency was similar. The thermal variables do not supply a complete explanation for the count trajectory. The data show analysis-window sensitivity and do not show improved cardiovascular health after COVID-19.</w:t>
+        <w:t>Monthly first CHD and HF hospitalisations declined across 2013–2023, with a further trough in 2020. Cold-day point estimates were larger in the nested pre-2020 window than in the full window. No period interaction or separate post-2020 Model 1 estimate was fitted. Later years were hotter, while cold-day frequency was similar. The thermal variables do not supply a complete explanation for the count trajectory. The data show analysis-window sensitivity and do not show improved cardiovascular health after COVID-19.</w:t>
       </w:r>
     </w:p>
     <w:p>
@@ -5559,7 +5559,7 @@
 
 <file path=word/comments.xml><?xml version="1.0" encoding="utf-8"?>
 <w:comments xmlns:a="http://schemas.openxmlformats.org/drawingml/2006/main" xmlns:pic="http://schemas.openxmlformats.org/drawingml/2006/picture" xmlns:r="http://schemas.openxmlformats.org/officeDocument/2006/relationships" xmlns:w="http://schemas.openxmlformats.org/wordprocessingml/2006/main" xmlns:wp="http://schemas.openxmlformats.org/drawingml/2006/wordprocessingDrawing" xmlns:mc="http://schemas.openxmlformats.org/markup-compatibility/2006" xmlns:a14="http://schemas.microsoft.com/office/drawing/2010/main" xmlns:w14="http://schemas.microsoft.com/office/word/2010/wordml" xmlns:wpc="http://schemas.microsoft.com/office/word/2010/wordprocessingCanvas">
-  <w:comment w:id="0" w:author="Bob Shen" w:initials="BS" w:date="2026-09-10T12:32:41Z">
+  <w:comment w:id="0" w:author="Bob Shen" w:initials="BS" w:date="2026-09-10T13:59:50Z">
     <w:p>
       <w:pPr>
         <w:pStyle w:val="CommentText"/>
@@ -5575,7 +5575,7 @@
       </w:r>
     </w:p>
   </w:comment>
-  <w:comment w:id="1" w:author="Bob Shen" w:initials="BS" w:date="2026-09-10T12:32:42Z">
+  <w:comment w:id="1" w:author="Bob Shen" w:initials="BS" w:date="2026-09-10T13:59:50Z">
     <w:p>
       <w:pPr>
         <w:pStyle w:val="CommentText"/>
@@ -5591,7 +5591,7 @@
       </w:r>
     </w:p>
   </w:comment>
-  <w:comment w:id="2" w:author="Bob Shen" w:initials="BS" w:date="2026-09-10T12:32:42Z">
+  <w:comment w:id="2" w:author="Bob Shen" w:initials="BS" w:date="2026-09-10T13:59:50Z">
     <w:p>
       <w:pPr>
         <w:pStyle w:val="CommentText"/>
@@ -5607,7 +5607,7 @@
       </w:r>
     </w:p>
   </w:comment>
-  <w:comment w:id="3" w:author="Bob Shen" w:initials="BS" w:date="2026-09-10T12:32:42Z">
+  <w:comment w:id="3" w:author="Bob Shen" w:initials="BS" w:date="2026-09-10T13:59:50Z">
     <w:p>
       <w:pPr>
         <w:pStyle w:val="CommentText"/>
@@ -5623,7 +5623,7 @@
       </w:r>
     </w:p>
   </w:comment>
-  <w:comment w:id="4" w:author="Bob Shen" w:initials="BS" w:date="2026-09-10T12:32:42Z">
+  <w:comment w:id="4" w:author="Bob Shen" w:initials="BS" w:date="2026-09-10T13:59:50Z">
     <w:p>
       <w:pPr>
         <w:pStyle w:val="CommentText"/>
@@ -5639,7 +5639,7 @@
       </w:r>
     </w:p>
   </w:comment>
-  <w:comment w:id="5" w:author="Bob Shen" w:initials="BS" w:date="2026-09-10T12:32:42Z">
+  <w:comment w:id="5" w:author="Bob Shen" w:initials="BS" w:date="2026-09-10T13:59:50Z">
     <w:p>
       <w:pPr>
         <w:pStyle w:val="CommentText"/>
@@ -5655,7 +5655,7 @@
       </w:r>
     </w:p>
   </w:comment>
-  <w:comment w:id="6" w:author="Bob Shen" w:initials="BS" w:date="2026-09-10T12:32:42Z">
+  <w:comment w:id="6" w:author="Bob Shen" w:initials="BS" w:date="2026-09-10T13:59:50Z">
     <w:p>
       <w:pPr>
         <w:pStyle w:val="CommentText"/>
@@ -5671,7 +5671,7 @@
       </w:r>
     </w:p>
   </w:comment>
-  <w:comment w:id="7" w:author="Bob Shen" w:initials="BS" w:date="2026-09-10T12:32:42Z">
+  <w:comment w:id="7" w:author="Bob Shen" w:initials="BS" w:date="2026-09-10T13:59:50Z">
     <w:p>
       <w:pPr>
         <w:pStyle w:val="CommentText"/>
@@ -5687,7 +5687,7 @@
       </w:r>
     </w:p>
   </w:comment>
-  <w:comment w:id="8" w:author="Bob Shen" w:initials="BS" w:date="2026-09-10T12:32:42Z">
+  <w:comment w:id="8" w:author="Bob Shen" w:initials="BS" w:date="2026-09-10T13:59:50Z">
     <w:p>
       <w:pPr>
         <w:pStyle w:val="CommentText"/>

</xml_diff>